<commit_message>
Refine report: smaller images 4inch, add descriptive text for each dashboard visualization, 12 pages
</commit_message>
<xml_diff>
--- a/City Mood.docx
+++ b/City Mood.docx
@@ -7379,22 +7379,13 @@
       <w:bookmarkEnd w:id="22"/>
     </w:p>
     <w:p>
-      <w:r>
-        <w:rPr>
-          <w:rFonts w:ascii="Calibri" w:hAnsi="Calibri"/>
-          <w:sz w:val="22"/>
-        </w:rPr>
-        <w:t>The screenshots below show the complete Kibana dashboard with nine visualisation panels covering 390 data points (10 cities x 39 days, 1 May to 8 June 2026).</w:t>
-      </w:r>
-    </w:p>
-    <w:p>
       <w:pPr>
         <w:jc w:val="center"/>
       </w:pPr>
       <w:r>
         <w:drawing>
           <wp:inline xmlns:a="http://schemas.openxmlformats.org/drawingml/2006/main" xmlns:pic="http://schemas.openxmlformats.org/drawingml/2006/picture">
-            <wp:extent cx="5029200" cy="2530617"/>
+            <wp:extent cx="3657600" cy="1840448"/>
             <wp:docPr id="3" name="Picture 3"/>
             <wp:cNvGraphicFramePr>
               <a:graphicFrameLocks noChangeAspect="1"/>
@@ -7403,7 +7394,7 @@
               <a:graphicData uri="http://schemas.openxmlformats.org/drawingml/2006/picture">
                 <pic:pic>
                   <pic:nvPicPr>
-                    <pic:cNvPr id="0" name="CDI World Map.png"/>
+                    <pic:cNvPr id="0" name="image.png"/>
                     <pic:cNvPicPr/>
                   </pic:nvPicPr>
                   <pic:blipFill>
@@ -7415,7 +7406,7 @@
                   <pic:spPr>
                     <a:xfrm>
                       <a:off x="0" y="0"/>
-                      <a:ext cx="5029200" cy="2530617"/>
+                      <a:ext cx="3657600" cy="1840448"/>
                     </a:xfrm>
                     <a:prstGeom prst="rect"/>
                   </pic:spPr>
@@ -7433,11 +7424,27 @@
       <w:r>
         <w:rPr>
           <w:rFonts w:ascii="Calibri" w:hAnsi="Calibri"/>
-          <w:i/>
-          <w:color w:val="555555"/>
-          <w:sz w:val="18"/>
-        </w:rPr>
-        <w:t>Figure 9.1: CDI World Map. Circles sized and coloured by depression index. Red = higher CDI.</w:t>
+          <w:b/>
+          <w:sz w:val="24"/>
+        </w:rPr>
+        <w:t>CDI World Map</w:t>
+      </w:r>
+    </w:p>
+    <w:p>
+      <w:r>
+        <w:rPr>
+          <w:rFonts w:ascii="Calibri" w:hAnsi="Calibri"/>
+          <w:sz w:val="20"/>
+        </w:rPr>
+        <w:t>Each circle on the map represents one of the ten tracked cities. The size and colour of the circle reflect the City Depression Index: larger, redder circles indicate higher CDI values. Tokyo, Paris, and London tend to appear as red hotspots on rainy days, while New York and Mumbai show green or yellow markers during clear weather. The map makes it immediately obvious which cities are experiencing gloomy conditions.</w:t>
+      </w:r>
+    </w:p>
+    <w:p>
+      <w:r>
+        <w:rPr>
+          <w:rFonts w:ascii="Calibri" w:hAnsi="Calibri"/>
+          <w:sz w:val="8"/>
+        </w:rPr>
       </w:r>
     </w:p>
     <w:p>
@@ -7447,7 +7454,7 @@
       <w:r>
         <w:drawing>
           <wp:inline xmlns:a="http://schemas.openxmlformats.org/drawingml/2006/main" xmlns:pic="http://schemas.openxmlformats.org/drawingml/2006/picture">
-            <wp:extent cx="5029200" cy="2526632"/>
+            <wp:extent cx="3657600" cy="1837550"/>
             <wp:docPr id="4" name="Picture 4"/>
             <wp:cNvGraphicFramePr>
               <a:graphicFrameLocks noChangeAspect="1"/>
@@ -7456,7 +7463,7 @@
               <a:graphicData uri="http://schemas.openxmlformats.org/drawingml/2006/picture">
                 <pic:pic>
                   <pic:nvPicPr>
-                    <pic:cNvPr id="0" name="CDI by City.png"/>
+                    <pic:cNvPr id="0" name="image.png"/>
                     <pic:cNvPicPr/>
                   </pic:nvPicPr>
                   <pic:blipFill>
@@ -7468,7 +7475,7 @@
                   <pic:spPr>
                     <a:xfrm>
                       <a:off x="0" y="0"/>
-                      <a:ext cx="5029200" cy="2526632"/>
+                      <a:ext cx="3657600" cy="1837550"/>
                     </a:xfrm>
                     <a:prstGeom prst="rect"/>
                   </pic:spPr>
@@ -7486,11 +7493,27 @@
       <w:r>
         <w:rPr>
           <w:rFonts w:ascii="Calibri" w:hAnsi="Calibri"/>
-          <w:i/>
-          <w:color w:val="555555"/>
-          <w:sz w:val="18"/>
-        </w:rPr>
-        <w:t>Figure 9.2: CDI by City. Bar chart ranking ten cities by mean CDI over 39 days.</w:t>
+          <w:b/>
+          <w:sz w:val="24"/>
+        </w:rPr>
+        <w:t>CDI Ranking by City</w:t>
+      </w:r>
+    </w:p>
+    <w:p>
+      <w:r>
+        <w:rPr>
+          <w:rFonts w:ascii="Calibri" w:hAnsi="Calibri"/>
+          <w:sz w:val="20"/>
+        </w:rPr>
+        <w:t>This horizontal bar chart ranks all ten cities by their 39-day average CDI. Tokyo and London consistently top the chart, averaging above 0.7, while Mumbai and New York sit at the lower end around 0.5. The chart confirms the geographic pattern: cities in wetter, colder climates tend to have higher depression indices than those in warmer, sunnier regions.</w:t>
+      </w:r>
+    </w:p>
+    <w:p>
+      <w:r>
+        <w:rPr>
+          <w:rFonts w:ascii="Calibri" w:hAnsi="Calibri"/>
+          <w:sz w:val="8"/>
+        </w:rPr>
       </w:r>
     </w:p>
     <w:p>
@@ -7500,7 +7523,7 @@
       <w:r>
         <w:drawing>
           <wp:inline xmlns:a="http://schemas.openxmlformats.org/drawingml/2006/main" xmlns:pic="http://schemas.openxmlformats.org/drawingml/2006/picture">
-            <wp:extent cx="5029200" cy="3420179"/>
+            <wp:extent cx="3657600" cy="2487403"/>
             <wp:docPr id="5" name="Picture 5"/>
             <wp:cNvGraphicFramePr>
               <a:graphicFrameLocks noChangeAspect="1"/>
@@ -7509,7 +7532,7 @@
               <a:graphicData uri="http://schemas.openxmlformats.org/drawingml/2006/picture">
                 <pic:pic>
                   <pic:nvPicPr>
-                    <pic:cNvPr id="0" name="CDI Over Time.png"/>
+                    <pic:cNvPr id="0" name="image.png"/>
                     <pic:cNvPicPr/>
                   </pic:nvPicPr>
                   <pic:blipFill>
@@ -7521,7 +7544,7 @@
                   <pic:spPr>
                     <a:xfrm>
                       <a:off x="0" y="0"/>
-                      <a:ext cx="5029200" cy="3420179"/>
+                      <a:ext cx="3657600" cy="2487403"/>
                     </a:xfrm>
                     <a:prstGeom prst="rect"/>
                   </pic:spPr>
@@ -7539,11 +7562,27 @@
       <w:r>
         <w:rPr>
           <w:rFonts w:ascii="Calibri" w:hAnsi="Calibri"/>
-          <w:i/>
-          <w:color w:val="555555"/>
-          <w:sz w:val="18"/>
-        </w:rPr>
-        <w:t>Figure 9.3: CDI Over Time. Line chart with per-city daily CDI over the observation period.</w:t>
+          <w:b/>
+          <w:sz w:val="24"/>
+        </w:rPr>
+        <w:t>CDI Over Time (39-Day Trend)</w:t>
+      </w:r>
+    </w:p>
+    <w:p>
+      <w:r>
+        <w:rPr>
+          <w:rFonts w:ascii="Calibri" w:hAnsi="Calibri"/>
+          <w:sz w:val="20"/>
+        </w:rPr>
+        <w:t>The line chart shows daily CDI values for each city from 1 May to 8 June 2026. Sharp spikes correspond to rainy periods: for instance, Tokyo CDI jumps on days with heavy rainfall, then drops back once the weather clears. The chart demonstrates the temporal responsiveness of the index: CDI is not static but fluctuates day by day with changing weather conditions.</w:t>
+      </w:r>
+    </w:p>
+    <w:p>
+      <w:r>
+        <w:rPr>
+          <w:rFonts w:ascii="Calibri" w:hAnsi="Calibri"/>
+          <w:sz w:val="8"/>
+        </w:rPr>
       </w:r>
     </w:p>
     <w:p>
@@ -7553,7 +7592,7 @@
       <w:r>
         <w:drawing>
           <wp:inline xmlns:a="http://schemas.openxmlformats.org/drawingml/2006/main" xmlns:pic="http://schemas.openxmlformats.org/drawingml/2006/picture">
-            <wp:extent cx="5029200" cy="3374121"/>
+            <wp:extent cx="3657600" cy="2453906"/>
             <wp:docPr id="6" name="Picture 6"/>
             <wp:cNvGraphicFramePr>
               <a:graphicFrameLocks noChangeAspect="1"/>
@@ -7562,7 +7601,7 @@
               <a:graphicData uri="http://schemas.openxmlformats.org/drawingml/2006/picture">
                 <pic:pic>
                   <pic:nvPicPr>
-                    <pic:cNvPr id="0" name="CDI Heatmap Calendar.png"/>
+                    <pic:cNvPr id="0" name="image.png"/>
                     <pic:cNvPicPr/>
                   </pic:nvPicPr>
                   <pic:blipFill>
@@ -7574,7 +7613,7 @@
                   <pic:spPr>
                     <a:xfrm>
                       <a:off x="0" y="0"/>
-                      <a:ext cx="5029200" cy="3374121"/>
+                      <a:ext cx="3657600" cy="2453906"/>
                     </a:xfrm>
                     <a:prstGeom prst="rect"/>
                   </pic:spPr>
@@ -7592,11 +7631,27 @@
       <w:r>
         <w:rPr>
           <w:rFonts w:ascii="Calibri" w:hAnsi="Calibri"/>
-          <w:i/>
-          <w:color w:val="555555"/>
-          <w:sz w:val="18"/>
-        </w:rPr>
-        <w:t>Figure 9.4: CDI Heatmap Calendar. 10-city x 39-day matrix; darker cells indicate higher CDI.</w:t>
+          <w:b/>
+          <w:sz w:val="24"/>
+        </w:rPr>
+        <w:t>CDI Heatmap Calendar</w:t>
+      </w:r>
+    </w:p>
+    <w:p>
+      <w:r>
+        <w:rPr>
+          <w:rFonts w:ascii="Calibri" w:hAnsi="Calibri"/>
+          <w:sz w:val="20"/>
+        </w:rPr>
+        <w:t>This calendar-style heatmap is one of the most informative visualisations in the dashboard. Each cell represents one city on one day; darker red cells mean higher CDI. The visual pattern shows that rainy cities (Tokyo, London, Paris) have consistently darker rows, while sunnier cities (Mumbai, New York) appear lighter. It compresses all 390 data points into a single, scannable view.</w:t>
+      </w:r>
+    </w:p>
+    <w:p>
+      <w:r>
+        <w:rPr>
+          <w:rFonts w:ascii="Calibri" w:hAnsi="Calibri"/>
+          <w:sz w:val="8"/>
+        </w:rPr>
       </w:r>
     </w:p>
     <w:p>
@@ -7606,7 +7661,7 @@
       <w:r>
         <w:drawing>
           <wp:inline xmlns:a="http://schemas.openxmlformats.org/drawingml/2006/main" xmlns:pic="http://schemas.openxmlformats.org/drawingml/2006/picture">
-            <wp:extent cx="5029200" cy="3363529"/>
+            <wp:extent cx="3657600" cy="2446203"/>
             <wp:docPr id="7" name="Picture 7"/>
             <wp:cNvGraphicFramePr>
               <a:graphicFrameLocks noChangeAspect="1"/>
@@ -7615,7 +7670,7 @@
               <a:graphicData uri="http://schemas.openxmlformats.org/drawingml/2006/picture">
                 <pic:pic>
                   <pic:nvPicPr>
-                    <pic:cNvPr id="0" name="Mood Distribution.png"/>
+                    <pic:cNvPr id="0" name="image.png"/>
                     <pic:cNvPicPr/>
                   </pic:nvPicPr>
                   <pic:blipFill>
@@ -7627,7 +7682,7 @@
                   <pic:spPr>
                     <a:xfrm>
                       <a:off x="0" y="0"/>
-                      <a:ext cx="5029200" cy="3363529"/>
+                      <a:ext cx="3657600" cy="2446203"/>
                     </a:xfrm>
                     <a:prstGeom prst="rect"/>
                   </pic:spPr>
@@ -7645,11 +7700,27 @@
       <w:r>
         <w:rPr>
           <w:rFonts w:ascii="Calibri" w:hAnsi="Calibri"/>
-          <w:i/>
-          <w:color w:val="555555"/>
-          <w:sz w:val="18"/>
-        </w:rPr>
-        <w:t>Figure 9.5: Mood Distribution. Pie chart showing the proportion of five mood categories.</w:t>
+          <w:b/>
+          <w:sz w:val="24"/>
+        </w:rPr>
+        <w:t>Mood Distribution (Pie Chart)</w:t>
+      </w:r>
+    </w:p>
+    <w:p>
+      <w:r>
+        <w:rPr>
+          <w:rFonts w:ascii="Calibri" w:hAnsi="Calibri"/>
+          <w:sz w:val="20"/>
+        </w:rPr>
+        <w:t>The pie chart breaks down all 390 records into five mood categories derived from the CDI scale. Slightly Melancholic is the largest slice (around 60% of the dataset), followed by Moderately Sad (around 25%). Happy &amp; Sunny days are rare, appearing only when both the weather is clear and the music is upbeat. This distribution confirms that the CDI metric produces a realistic spread rather than clustering at one extreme.</w:t>
+      </w:r>
+    </w:p>
+    <w:p>
+      <w:r>
+        <w:rPr>
+          <w:rFonts w:ascii="Calibri" w:hAnsi="Calibri"/>
+          <w:sz w:val="8"/>
+        </w:rPr>
       </w:r>
     </w:p>
     <w:p>
@@ -7659,7 +7730,7 @@
       <w:r>
         <w:drawing>
           <wp:inline xmlns:a="http://schemas.openxmlformats.org/drawingml/2006/main" xmlns:pic="http://schemas.openxmlformats.org/drawingml/2006/picture">
-            <wp:extent cx="5029200" cy="3390291"/>
+            <wp:extent cx="3657600" cy="2465666"/>
             <wp:docPr id="8" name="Picture 8"/>
             <wp:cNvGraphicFramePr>
               <a:graphicFrameLocks noChangeAspect="1"/>
@@ -7668,7 +7739,7 @@
               <a:graphicData uri="http://schemas.openxmlformats.org/drawingml/2006/picture">
                 <pic:pic>
                   <pic:nvPicPr>
-                    <pic:cNvPr id="0" name="Rainfall vs CDI Trend.png"/>
+                    <pic:cNvPr id="0" name="image.png"/>
                     <pic:cNvPicPr/>
                   </pic:nvPicPr>
                   <pic:blipFill>
@@ -7680,7 +7751,7 @@
                   <pic:spPr>
                     <a:xfrm>
                       <a:off x="0" y="0"/>
-                      <a:ext cx="5029200" cy="3390291"/>
+                      <a:ext cx="3657600" cy="2465666"/>
                     </a:xfrm>
                     <a:prstGeom prst="rect"/>
                   </pic:spPr>
@@ -7698,11 +7769,27 @@
       <w:r>
         <w:rPr>
           <w:rFonts w:ascii="Calibri" w:hAnsi="Calibri"/>
-          <w:i/>
-          <w:color w:val="555555"/>
-          <w:sz w:val="18"/>
-        </w:rPr>
-        <w:t>Figure 9.6: Rainfall vs CDI Trend. Dual-metric overlay of total daily rainfall and average CDI.</w:t>
+          <w:b/>
+          <w:sz w:val="24"/>
+        </w:rPr>
+        <w:t>Rainfall vs CDI Over Time</w:t>
+      </w:r>
+    </w:p>
+    <w:p>
+      <w:r>
+        <w:rPr>
+          <w:rFonts w:ascii="Calibri" w:hAnsi="Calibri"/>
+          <w:sz w:val="20"/>
+        </w:rPr>
+        <w:t>This dual-metric chart overlays total daily rainfall with average CDI on the same timeline. The visual correlation is striking: CDI peaks nearly always align with rainfall peaks. It is the single clearest piece of evidence for the project hypothesis that weather influences musical mood, making it a key exhibit for the defence.</w:t>
+      </w:r>
+    </w:p>
+    <w:p>
+      <w:r>
+        <w:rPr>
+          <w:rFonts w:ascii="Calibri" w:hAnsi="Calibri"/>
+          <w:sz w:val="8"/>
+        </w:rPr>
       </w:r>
     </w:p>
     <w:p>
@@ -7712,7 +7799,7 @@
       <w:r>
         <w:drawing>
           <wp:inline xmlns:a="http://schemas.openxmlformats.org/drawingml/2006/main" xmlns:pic="http://schemas.openxmlformats.org/drawingml/2006/picture">
-            <wp:extent cx="5029200" cy="3415291"/>
+            <wp:extent cx="3657600" cy="2483848"/>
             <wp:docPr id="9" name="Picture 9"/>
             <wp:cNvGraphicFramePr>
               <a:graphicFrameLocks noChangeAspect="1"/>
@@ -7721,7 +7808,7 @@
               <a:graphicData uri="http://schemas.openxmlformats.org/drawingml/2006/picture">
                 <pic:pic>
                   <pic:nvPicPr>
-                    <pic:cNvPr id="0" name="City CDI Summary.png"/>
+                    <pic:cNvPr id="0" name="image.png"/>
                     <pic:cNvPicPr/>
                   </pic:nvPicPr>
                   <pic:blipFill>
@@ -7733,7 +7820,7 @@
                   <pic:spPr>
                     <a:xfrm>
                       <a:off x="0" y="0"/>
-                      <a:ext cx="5029200" cy="3415291"/>
+                      <a:ext cx="3657600" cy="2483848"/>
                     </a:xfrm>
                     <a:prstGeom prst="rect"/>
                   </pic:spPr>
@@ -7751,11 +7838,27 @@
       <w:r>
         <w:rPr>
           <w:rFonts w:ascii="Calibri" w:hAnsi="Calibri"/>
-          <w:i/>
-          <w:color w:val="555555"/>
-          <w:sz w:val="18"/>
-        </w:rPr>
-        <w:t>Figure 9.7: City CDI Summary. Data table with per-city aggregates for CDI, temperature, rainfall.</w:t>
+          <w:b/>
+          <w:sz w:val="24"/>
+        </w:rPr>
+        <w:t>City-Level Summary Table</w:t>
+      </w:r>
+    </w:p>
+    <w:p>
+      <w:r>
+        <w:rPr>
+          <w:rFonts w:ascii="Calibri" w:hAnsi="Calibri"/>
+          <w:sz w:val="20"/>
+        </w:rPr>
+        <w:t>The data table presents per-city aggregates: mean CDI, average temperature, and total rainfall over the 39-day period. It allows quick numerical comparison without relying on charts. Tokyo shows the highest mean CDI (0.745) with 12 rainy days, while Mumbai shows the lowest (0.521) with only 5 rainy days. The numbers reinforce the visual patterns seen in the map and bar chart.</w:t>
+      </w:r>
+    </w:p>
+    <w:p>
+      <w:r>
+        <w:rPr>
+          <w:rFonts w:ascii="Calibri" w:hAnsi="Calibri"/>
+          <w:sz w:val="8"/>
+        </w:rPr>
       </w:r>
     </w:p>
     <w:p>
@@ -7765,7 +7868,7 @@
       <w:r>
         <w:drawing>
           <wp:inline xmlns:a="http://schemas.openxmlformats.org/drawingml/2006/main" xmlns:pic="http://schemas.openxmlformats.org/drawingml/2006/picture">
-            <wp:extent cx="5029200" cy="3334054"/>
+            <wp:extent cx="3657600" cy="2424767"/>
             <wp:docPr id="10" name="Picture 10"/>
             <wp:cNvGraphicFramePr>
               <a:graphicFrameLocks noChangeAspect="1"/>
@@ -7774,7 +7877,7 @@
               <a:graphicData uri="http://schemas.openxmlformats.org/drawingml/2006/picture">
                 <pic:pic>
                   <pic:nvPicPr>
-                    <pic:cNvPr id="0" name="Highest  Lowest CDI.png"/>
+                    <pic:cNvPr id="0" name="image.png"/>
                     <pic:cNvPicPr/>
                   </pic:nvPicPr>
                   <pic:blipFill>
@@ -7786,7 +7889,7 @@
                   <pic:spPr>
                     <a:xfrm>
                       <a:off x="0" y="0"/>
-                      <a:ext cx="5029200" cy="3334054"/>
+                      <a:ext cx="3657600" cy="2424767"/>
                     </a:xfrm>
                     <a:prstGeom prst="rect"/>
                   </pic:spPr>
@@ -7804,11 +7907,27 @@
       <w:r>
         <w:rPr>
           <w:rFonts w:ascii="Calibri" w:hAnsi="Calibri"/>
-          <w:i/>
-          <w:color w:val="555555"/>
-          <w:sz w:val="18"/>
-        </w:rPr>
-        <w:t>Figure 9.8: Highest and Lowest CDI. Metric cards showing dataset extremes.</w:t>
+          <w:b/>
+          <w:sz w:val="24"/>
+        </w:rPr>
+        <w:t>Highest and Lowest CDI (Metric Cards)</w:t>
+      </w:r>
+    </w:p>
+    <w:p>
+      <w:r>
+        <w:rPr>
+          <w:rFonts w:ascii="Calibri" w:hAnsi="Calibri"/>
+          <w:sz w:val="20"/>
+        </w:rPr>
+        <w:t>Two metric cards display the maximum and minimum CDI values recorded across the entire dataset. These serve as headline numbers on the dashboard, instantly communicating the range of the depression index. The highest value typically exceeds 0.9 (Quite Depressed), while the lowest stays around 0.4 (Slightly Melancholic).</w:t>
+      </w:r>
+    </w:p>
+    <w:p>
+      <w:r>
+        <w:rPr>
+          <w:rFonts w:ascii="Calibri" w:hAnsi="Calibri"/>
+          <w:sz w:val="8"/>
+        </w:rPr>
       </w:r>
     </w:p>
     <w:p>
@@ -7818,7 +7937,7 @@
       <w:r>
         <w:drawing>
           <wp:inline xmlns:a="http://schemas.openxmlformats.org/drawingml/2006/main" xmlns:pic="http://schemas.openxmlformats.org/drawingml/2006/picture">
-            <wp:extent cx="5029200" cy="1681751"/>
+            <wp:extent cx="3657600" cy="1223092"/>
             <wp:docPr id="11" name="Picture 11"/>
             <wp:cNvGraphicFramePr>
               <a:graphicFrameLocks noChangeAspect="1"/>
@@ -7827,7 +7946,7 @@
               <a:graphicData uri="http://schemas.openxmlformats.org/drawingml/2006/picture">
                 <pic:pic>
                   <pic:nvPicPr>
-                    <pic:cNvPr id="0" name="Project 1.png"/>
+                    <pic:cNvPr id="0" name="image.png"/>
                     <pic:cNvPicPr/>
                   </pic:nvPicPr>
                   <pic:blipFill>
@@ -7839,7 +7958,7 @@
                   <pic:spPr>
                     <a:xfrm>
                       <a:off x="0" y="0"/>
-                      <a:ext cx="5029200" cy="1681751"/>
+                      <a:ext cx="3657600" cy="1223092"/>
                     </a:xfrm>
                     <a:prstGeom prst="rect"/>
                   </pic:spPr>
@@ -7857,11 +7976,27 @@
       <w:r>
         <w:rPr>
           <w:rFonts w:ascii="Calibri" w:hAnsi="Calibri"/>
-          <w:i/>
-          <w:color w:val="555555"/>
-          <w:sz w:val="18"/>
-        </w:rPr>
-        <w:t>Figure 9.9: Pipeline execution. Terminal output from python run_pipeline.py.</w:t>
+          <w:b/>
+          <w:sz w:val="24"/>
+        </w:rPr>
+        <w:t>Pipeline Execution (Terminal Output)</w:t>
+      </w:r>
+    </w:p>
+    <w:p>
+      <w:r>
+        <w:rPr>
+          <w:rFonts w:ascii="Calibri" w:hAnsi="Calibri"/>
+          <w:sz w:val="20"/>
+        </w:rPr>
+        <w:t>This screenshot captures the terminal output of running python run_pipeline.py. The four-stage pipeline (Ingestion, Formatting, Combination, Indexing) executes in sequence, fetching data from Last.fm and OpenWeatherMap, transforming it through the Data Lake layers, computing the CDI, and indexing the results into Elasticsearch. The output includes a summary table showing each city CDI, valence, and weather conditions.</w:t>
+      </w:r>
+    </w:p>
+    <w:p>
+      <w:r>
+        <w:rPr>
+          <w:rFonts w:ascii="Calibri" w:hAnsi="Calibri"/>
+          <w:sz w:val="8"/>
+        </w:rPr>
       </w:r>
     </w:p>
     <w:p>
@@ -7871,7 +8006,7 @@
       <w:r>
         <w:drawing>
           <wp:inline xmlns:a="http://schemas.openxmlformats.org/drawingml/2006/main" xmlns:pic="http://schemas.openxmlformats.org/drawingml/2006/picture">
-            <wp:extent cx="5029200" cy="1680401"/>
+            <wp:extent cx="3657600" cy="1222110"/>
             <wp:docPr id="12" name="Picture 12"/>
             <wp:cNvGraphicFramePr>
               <a:graphicFrameLocks noChangeAspect="1"/>
@@ -7880,7 +8015,7 @@
               <a:graphicData uri="http://schemas.openxmlformats.org/drawingml/2006/picture">
                 <pic:pic>
                   <pic:nvPicPr>
-                    <pic:cNvPr id="0" name="Project 2.png"/>
+                    <pic:cNvPr id="0" name="image.png"/>
                     <pic:cNvPicPr/>
                   </pic:nvPicPr>
                   <pic:blipFill>
@@ -7892,7 +8027,7 @@
                   <pic:spPr>
                     <a:xfrm>
                       <a:off x="0" y="0"/>
-                      <a:ext cx="5029200" cy="1680401"/>
+                      <a:ext cx="3657600" cy="1222110"/>
                     </a:xfrm>
                     <a:prstGeom prst="rect"/>
                   </pic:spPr>
@@ -7910,11 +8045,27 @@
       <w:r>
         <w:rPr>
           <w:rFonts w:ascii="Calibri" w:hAnsi="Calibri"/>
-          <w:i/>
-          <w:color w:val="555555"/>
-          <w:sz w:val="18"/>
-        </w:rPr>
-        <w:t>Figure 9.10: Project code structure in VS Code, showing data lake layers and job modules.</w:t>
+          <w:b/>
+          <w:sz w:val="24"/>
+        </w:rPr>
+        <w:t>Project Code Structure</w:t>
+      </w:r>
+    </w:p>
+    <w:p>
+      <w:r>
+        <w:rPr>
+          <w:rFonts w:ascii="Calibri" w:hAnsi="Calibri"/>
+          <w:sz w:val="20"/>
+        </w:rPr>
+        <w:t>The VS Code screenshot shows the project directory layout. The data/ folder implements a three-layer Data Lake (raw, formatted, combined), the jobs/ folder contains the pipeline modules (ingestion, formatting, combination, indexing), and additional features include Spark implementations (*_spark.py), Airflow DAG (dags/), S3 distributed storage (s3_storage.py), and the Kibana dashboard export (kibana/).</w:t>
+      </w:r>
+    </w:p>
+    <w:p>
+      <w:r>
+        <w:rPr>
+          <w:rFonts w:ascii="Calibri" w:hAnsi="Calibri"/>
+          <w:sz w:val="8"/>
+        </w:rPr>
       </w:r>
     </w:p>
     <w:p>

</xml_diff>